<commit_message>
Generando y optimizando gastos_carro_graficas_comparacion_interpretacion_representacion_n2_op*_v1.Rmd
</commit_message>
<xml_diff>
--- a/Lab-Manjaro/01-S1-2024B/salida/gastos_carro_graficas_comparacion_interpretacion_representacion_n2_opA_v1_1.docx
+++ b/Lab-Manjaro/01-S1-2024B/salida/gastos_carro_graficas_comparacion_interpretacion_representacion_n2_opA_v1_1.docx
@@ -207,7 +207,7 @@
         </w:numPr>
       </w:pPr>
       <w:r>
-        <w:t xml:space="preserve">Si la persona quiere realizar una comparación entre los gastos totales por categoría, ¿cuál de las siguientes gráficas le permite hacer esto directamente?</w:t>
+        <w:t xml:space="preserve">Si la persona quiere identificar qué categoría de gasto representa la mayor proporción del presupuesto total, ¿cuál de las siguientes gráficas le permite hacer esto directamente?</w:t>
       </w:r>
     </w:p>
     <w:p>
@@ -220,14 +220,14 @@
       <w:r>
         <w:drawing>
           <wp:inline>
-            <wp:extent cx="3733800" cy="3712776"/>
+            <wp:extent cx="4267200" cy="2839440"/>
             <wp:effectExtent b="0" l="0" r="0" t="0"/>
             <wp:docPr descr="image" title="" id="25" name="Picture"/>
             <a:graphic>
               <a:graphicData uri="http://schemas.openxmlformats.org/drawingml/2006/picture">
                 <pic:pic>
                   <pic:nvPicPr>
-                    <pic:cNvPr descr="media/supplements1/exercise1/grafica_a.png" id="26" name="Picture"/>
+                    <pic:cNvPr descr="media/supplements1/exercise1/grafica_b.png" id="26" name="Picture"/>
                     <pic:cNvPicPr>
                       <a:picLocks noChangeArrowheads="1" noChangeAspect="1"/>
                     </pic:cNvPicPr>
@@ -241,7 +241,7 @@
                   <pic:spPr bwMode="auto">
                     <a:xfrm>
                       <a:off x="0" y="0"/>
-                      <a:ext cx="3733800" cy="3712776"/>
+                      <a:ext cx="4267200" cy="2839440"/>
                     </a:xfrm>
                     <a:prstGeom prst="rect">
                       <a:avLst/>
@@ -270,14 +270,14 @@
       <w:r>
         <w:drawing>
           <wp:inline>
-            <wp:extent cx="4267200" cy="2839440"/>
+            <wp:extent cx="3733800" cy="4015767"/>
             <wp:effectExtent b="0" l="0" r="0" t="0"/>
             <wp:docPr descr="image" title="" id="28" name="Picture"/>
             <a:graphic>
               <a:graphicData uri="http://schemas.openxmlformats.org/drawingml/2006/picture">
                 <pic:pic>
                   <pic:nvPicPr>
-                    <pic:cNvPr descr="media/supplements1/exercise1/grafica_b.png" id="29" name="Picture"/>
+                    <pic:cNvPr descr="media/supplements1/exercise1/grafica_c.png" id="29" name="Picture"/>
                     <pic:cNvPicPr>
                       <a:picLocks noChangeArrowheads="1" noChangeAspect="1"/>
                     </pic:cNvPicPr>
@@ -291,7 +291,7 @@
                   <pic:spPr bwMode="auto">
                     <a:xfrm>
                       <a:off x="0" y="0"/>
-                      <a:ext cx="4267200" cy="2839440"/>
+                      <a:ext cx="3733800" cy="4015767"/>
                     </a:xfrm>
                     <a:prstGeom prst="rect">
                       <a:avLst/>
@@ -370,14 +370,14 @@
       <w:r>
         <w:drawing>
           <wp:inline>
-            <wp:extent cx="3733800" cy="3939002"/>
+            <wp:extent cx="3733800" cy="3733800"/>
             <wp:effectExtent b="0" l="0" r="0" t="0"/>
             <wp:docPr descr="image" title="" id="34" name="Picture"/>
             <a:graphic>
               <a:graphicData uri="http://schemas.openxmlformats.org/drawingml/2006/picture">
                 <pic:pic>
                   <pic:nvPicPr>
-                    <pic:cNvPr descr="media/supplements1/exercise1/grafica_c.png" id="35" name="Picture"/>
+                    <pic:cNvPr descr="media/supplements1/exercise1/grafica_a.png" id="35" name="Picture"/>
                     <pic:cNvPicPr>
                       <a:picLocks noChangeArrowheads="1" noChangeAspect="1"/>
                     </pic:cNvPicPr>
@@ -391,7 +391,7 @@
                   <pic:spPr bwMode="auto">
                     <a:xfrm>
                       <a:off x="0" y="0"/>
-                      <a:ext cx="3733800" cy="3939002"/>
+                      <a:ext cx="3733800" cy="3733800"/>
                     </a:xfrm>
                     <a:prstGeom prst="rect">
                       <a:avLst/>
@@ -428,7 +428,7 @@
         <w:br/>
       </w:r>
       <w:r>
-        <w:t xml:space="preserve">Para resolver este problema, necesitamos identificar qué tipo de gráfica permite comparar directamente los</w:t>
+        <w:t xml:space="preserve">Para resolver este problema, necesitamos identificar qué tipo de gráfica permite identificar directamente</w:t>
       </w:r>
       <w:r>
         <w:t xml:space="preserve"> </w:t>
@@ -438,7 +438,7 @@
           <w:b/>
           <w:bCs/>
         </w:rPr>
-        <w:t xml:space="preserve">gastos totales por categoría</w:t>
+        <w:t xml:space="preserve">qué categoría representa la mayor proporción del presupuesto total</w:t>
       </w:r>
       <w:r>
         <w:t xml:space="preserve">.</w:t>
@@ -466,7 +466,7 @@
         </w:numPr>
       </w:pPr>
       <w:r>
-        <w:t xml:space="preserve">Primero, calculemos los gastos totales por categoría:</w:t>
+        <w:t xml:space="preserve">Primero, calculemos los gastos totales por categoría y sus proporciones:</w:t>
       </w:r>
     </w:p>
     <w:p>
@@ -487,7 +487,7 @@
         <w:t xml:space="preserve"> </w:t>
       </w:r>
       <w:r>
-        <w:t xml:space="preserve">$33.000 + $29.000 + $36.000 + $39.000 = $137.000</w:t>
+        <w:t xml:space="preserve">$139.000 = 43.3% del total</w:t>
       </w:r>
     </w:p>
     <w:p>
@@ -508,7 +508,7 @@
         <w:t xml:space="preserve"> </w:t>
       </w:r>
       <w:r>
-        <w:t xml:space="preserve">$20.000 + $26.000 + $21.000 + $17.000 = $84.000</w:t>
+        <w:t xml:space="preserve">$102.000 = 31.8% del total</w:t>
       </w:r>
     </w:p>
     <w:p>
@@ -529,7 +529,55 @@
         <w:t xml:space="preserve"> </w:t>
       </w:r>
       <w:r>
-        <w:t xml:space="preserve">$11.000 + $22.000 + $21.000 + $19.000 = $73.000</w:t>
+        <w:t xml:space="preserve">$80.000 = 24.9% del total</w:t>
+      </w:r>
+    </w:p>
+    <w:p>
+      <w:pPr>
+        <w:numPr>
+          <w:ilvl w:val="0"/>
+          <w:numId w:val="1000"/>
+        </w:numPr>
+      </w:pPr>
+      <w:r>
+        <w:rPr>
+          <w:b/>
+          <w:bCs/>
+        </w:rPr>
+        <w:t xml:space="preserve">Total general:</w:t>
+      </w:r>
+      <w:r>
+        <w:t xml:space="preserve"> </w:t>
+      </w:r>
+      <w:r>
+        <w:t xml:space="preserve">$321.000</w:t>
+      </w:r>
+    </w:p>
+    <w:p>
+      <w:pPr>
+        <w:numPr>
+          <w:ilvl w:val="0"/>
+          <w:numId w:val="1000"/>
+        </w:numPr>
+      </w:pPr>
+      <w:r>
+        <w:t xml:space="preserve">Como podemos observar,</w:t>
+      </w:r>
+      <w:r>
+        <w:t xml:space="preserve"> </w:t>
+      </w:r>
+      <w:r>
+        <w:rPr>
+          <w:b/>
+          <w:bCs/>
+        </w:rPr>
+        <w:t xml:space="preserve">Gasolina</w:t>
+      </w:r>
+      <w:r>
+        <w:t xml:space="preserve"> </w:t>
+      </w:r>
+      <w:r>
+        <w:t xml:space="preserve">representa la mayor proporción del presupuesto total.</w:t>
       </w:r>
     </w:p>
     <w:p>
@@ -580,7 +628,7 @@
         </w:numPr>
       </w:pPr>
       <w:r>
-        <w:t xml:space="preserve">Permite comparar directamente los gastos totales por categoría mediante los porcentajes</w:t>
+        <w:t xml:space="preserve">Los porcentajes indican claramente qué categoría representa la mayor proporción del presupuesto</w:t>
       </w:r>
     </w:p>
     <w:p>
@@ -591,7 +639,7 @@
         </w:numPr>
       </w:pPr>
       <w:r>
-        <w:t xml:space="preserve">Los porcentajes indican claramente qué categoría representa mayor gasto</w:t>
+        <w:t xml:space="preserve">Permite identificar directamente la categoría dominante sin necesidad de cálculos adicionales</w:t>
       </w:r>
     </w:p>
     <w:p>
@@ -654,7 +702,7 @@
         </w:numPr>
       </w:pPr>
       <w:r>
-        <w:t xml:space="preserve">NO permite comparar directamente gastos totales por categoría</w:t>
+        <w:t xml:space="preserve">NO permite identificar directamente qué categoría representa la mayor proporción</w:t>
       </w:r>
     </w:p>
     <w:p>
@@ -691,7 +739,7 @@
         </w:numPr>
       </w:pPr>
       <w:r>
-        <w:t xml:space="preserve">NO permite comparar gastos totales por categoría</w:t>
+        <w:t xml:space="preserve">NO permite identificar qué categoría representa la mayor proporción del presupuesto</w:t>
       </w:r>
     </w:p>
     <w:p>
@@ -739,7 +787,7 @@
         </w:numPr>
       </w:pPr>
       <w:r>
-        <w:t xml:space="preserve">Dificulta la comparación de gastos totales por categoría</w:t>
+        <w:t xml:space="preserve">Requiere sumar mentalmente las barras de cada categoría para identificar la proporción dominante</w:t>
       </w:r>
     </w:p>
     <w:p>
@@ -808,7 +856,7 @@
         <w:t xml:space="preserve"> </w:t>
       </w:r>
       <w:r>
-        <w:t xml:space="preserve">es la única que permite comparar directamente los gastos totales por categoría, ya que muestra claramente la proporción que representa cada tipo de gasto del total general.</w:t>
+        <w:t xml:space="preserve">es la única que permite identificar directamente qué categoría representa la mayor proporción del presupuesto total, ya que muestra claramente los porcentajes de cada tipo de gasto respecto al total general, facilitando la identificación inmediata de la categoría dominante.</w:t>
       </w:r>
     </w:p>
     <w:p>
@@ -819,7 +867,7 @@
         </w:numPr>
       </w:pPr>
       <w:r>
-        <w:t xml:space="preserve">Verdadero</w:t>
+        <w:t xml:space="preserve">Falso</w:t>
       </w:r>
     </w:p>
     <w:p>
@@ -852,7 +900,7 @@
         </w:numPr>
       </w:pPr>
       <w:r>
-        <w:t xml:space="preserve">Falso</w:t>
+        <w:t xml:space="preserve">Verdadero</w:t>
       </w:r>
     </w:p>
     <w:bookmarkEnd w:id="39"/>

</xml_diff>